<commit_message>
ROWS y HEADER all list
</commit_message>
<xml_diff>
--- a/Cambios de valores/Cambiar ROWS y HEADER en list.docx
+++ b/Cambios de valores/Cambiar ROWS y HEADER en list.docx
@@ -3,7 +3,15 @@
 <w:document xmlns:wpc="http://schemas.microsoft.com/office/word/2010/wordprocessingCanvas" xmlns:cx="http://schemas.microsoft.com/office/drawing/2014/chartex" xmlns:cx1="http://schemas.microsoft.com/office/drawing/2015/9/8/chartex" xmlns:cx2="http://schemas.microsoft.com/office/drawing/2015/10/21/chartex" xmlns:cx3="http://schemas.microsoft.com/office/drawing/2016/5/9/chartex" xmlns:cx4="http://schemas.microsoft.com/office/drawing/2016/5/10/chartex" xmlns:cx5="http://schemas.microsoft.com/office/drawing/2016/5/11/chartex" xmlns:cx6="http://schemas.microsoft.com/office/drawing/2016/5/12/chartex" xmlns:cx7="http://schemas.microsoft.com/office/drawing/2016/5/13/chartex" xmlns:cx8="http://schemas.microsoft.com/office/drawing/2016/5/14/chartex" xmlns:mc="http://schemas.openxmlformats.org/markup-compatibility/2006" xmlns:aink="http://schemas.microsoft.com/office/drawing/2016/ink" xmlns:am3d="http://schemas.microsoft.com/office/drawing/2017/model3d" xmlns:o="urn:schemas-microsoft-com:office:office" xmlns:r="http://schemas.openxmlformats.org/officeDocument/2006/relationships" xmlns:m="http://schemas.openxmlformats.org/officeDocument/2006/math" xmlns:v="urn:schemas-microsoft-com:vml" xmlns:wp14="http://schemas.microsoft.com/office/word/2010/wordprocessingDrawing" xmlns:wp="http://schemas.openxmlformats.org/drawingml/2006/wordprocessingDrawing" xmlns:w10="urn:schemas-microsoft-com:office:word" xmlns:w="http://schemas.openxmlformats.org/wordprocessingml/2006/main" xmlns:w14="http://schemas.microsoft.com/office/word/2010/wordml" xmlns:w15="http://schemas.microsoft.com/office/word/2012/wordml" xmlns:w16cex="http://schemas.microsoft.com/office/word/2018/wordml/cex" xmlns:w16cid="http://schemas.microsoft.com/office/word/2016/wordml/cid" xmlns:w16="http://schemas.microsoft.com/office/word/2018/wordml" xmlns:w16sdtdh="http://schemas.microsoft.com/office/word/2020/wordml/sdtdatahash" xmlns:w16se="http://schemas.microsoft.com/office/word/2015/wordml/symex" xmlns:wpg="http://schemas.microsoft.com/office/word/2010/wordprocessingGroup" xmlns:wpi="http://schemas.microsoft.com/office/word/2010/wordprocessingInk" xmlns:wne="http://schemas.microsoft.com/office/word/2006/wordml" xmlns:wps="http://schemas.microsoft.com/office/word/2010/wordprocessingShape" mc:Ignorable="w14 w15 w16se w16cid w16 w16cex w16sdtdh wp14">
   <w:body>
     <w:p>
-      <w:r>
+      <w:pPr>
+        <w:rPr>
+          <w:lang w:val="en-US"/>
+        </w:rPr>
+      </w:pPr>
+      <w:r>
+        <w:rPr>
+          <w:lang w:val="en-US"/>
+        </w:rPr>
         <w:t>Cambiar header en list</w:t>
       </w:r>
     </w:p>
@@ -1420,7 +1428,7 @@
           <w:color w:val="A9B1D6"/>
           <w:sz w:val="21"/>
           <w:szCs w:val="21"/>
-          <w:lang w:eastAsia="es-419"/>
+          <w:lang w:val="en-US" w:eastAsia="es-419"/>
         </w:rPr>
       </w:pPr>
       <w:r>
@@ -1439,7 +1447,7 @@
           <w:color w:val="9ABDF5"/>
           <w:sz w:val="21"/>
           <w:szCs w:val="21"/>
-          <w:lang w:eastAsia="es-419"/>
+          <w:lang w:val="en-US" w:eastAsia="es-419"/>
         </w:rPr>
         <w:t>{</w:t>
       </w:r>
@@ -1449,7 +1457,7 @@
           <w:color w:val="A9B1D6"/>
           <w:sz w:val="21"/>
           <w:szCs w:val="21"/>
-          <w:lang w:eastAsia="es-419"/>
+          <w:lang w:val="en-US" w:eastAsia="es-419"/>
         </w:rPr>
         <w:t xml:space="preserve"> </w:t>
       </w:r>
@@ -1459,7 +1467,7 @@
           <w:color w:val="73DACA"/>
           <w:sz w:val="21"/>
           <w:szCs w:val="21"/>
-          <w:lang w:eastAsia="es-419"/>
+          <w:lang w:val="en-US" w:eastAsia="es-419"/>
         </w:rPr>
         <w:t>id</w:t>
       </w:r>
@@ -1469,7 +1477,7 @@
           <w:color w:val="89DDFF"/>
           <w:sz w:val="21"/>
           <w:szCs w:val="21"/>
-          <w:lang w:eastAsia="es-419"/>
+          <w:lang w:val="en-US" w:eastAsia="es-419"/>
         </w:rPr>
         <w:t>:</w:t>
       </w:r>
@@ -1479,17 +1487,17 @@
           <w:color w:val="A9B1D6"/>
           <w:sz w:val="21"/>
           <w:szCs w:val="21"/>
-          <w:lang w:eastAsia="es-419"/>
-        </w:rPr>
-        <w:t xml:space="preserve"> </w:t>
-      </w:r>
-      <w:r>
-        <w:rPr>
-          <w:rFonts w:ascii="Consolas" w:eastAsia="Times New Roman" w:hAnsi="Consolas" w:cs="Times New Roman"/>
-          <w:color w:val="89DDFF"/>
-          <w:sz w:val="21"/>
-          <w:szCs w:val="21"/>
-          <w:lang w:eastAsia="es-419"/>
+          <w:lang w:val="en-US" w:eastAsia="es-419"/>
+        </w:rPr>
+        <w:t xml:space="preserve"> </w:t>
+      </w:r>
+      <w:r>
+        <w:rPr>
+          <w:rFonts w:ascii="Consolas" w:eastAsia="Times New Roman" w:hAnsi="Consolas" w:cs="Times New Roman"/>
+          <w:color w:val="89DDFF"/>
+          <w:sz w:val="21"/>
+          <w:szCs w:val="21"/>
+          <w:lang w:val="en-US" w:eastAsia="es-419"/>
         </w:rPr>
         <w:t>'',</w:t>
       </w:r>
@@ -1499,7 +1507,7 @@
           <w:color w:val="A9B1D6"/>
           <w:sz w:val="21"/>
           <w:szCs w:val="21"/>
-          <w:lang w:eastAsia="es-419"/>
+          <w:lang w:val="en-US" w:eastAsia="es-419"/>
         </w:rPr>
         <w:t xml:space="preserve"> </w:t>
       </w:r>
@@ -1509,7 +1517,7 @@
           <w:color w:val="73DACA"/>
           <w:sz w:val="21"/>
           <w:szCs w:val="21"/>
-          <w:lang w:eastAsia="es-419"/>
+          <w:lang w:val="en-US" w:eastAsia="es-419"/>
         </w:rPr>
         <w:t>width</w:t>
       </w:r>
@@ -1519,7 +1527,7 @@
           <w:color w:val="89DDFF"/>
           <w:sz w:val="21"/>
           <w:szCs w:val="21"/>
-          <w:lang w:eastAsia="es-419"/>
+          <w:lang w:val="en-US" w:eastAsia="es-419"/>
         </w:rPr>
         <w:t>:</w:t>
       </w:r>
@@ -1529,7 +1537,7 @@
           <w:color w:val="A9B1D6"/>
           <w:sz w:val="21"/>
           <w:szCs w:val="21"/>
-          <w:lang w:eastAsia="es-419"/>
+          <w:lang w:val="en-US" w:eastAsia="es-419"/>
         </w:rPr>
         <w:t xml:space="preserve"> </w:t>
       </w:r>
@@ -1539,7 +1547,7 @@
           <w:color w:val="FF9E64"/>
           <w:sz w:val="21"/>
           <w:szCs w:val="21"/>
-          <w:lang w:eastAsia="es-419"/>
+          <w:lang w:val="en-US" w:eastAsia="es-419"/>
         </w:rPr>
         <w:t>88</w:t>
       </w:r>
@@ -1549,7 +1557,7 @@
           <w:color w:val="A9B1D6"/>
           <w:sz w:val="21"/>
           <w:szCs w:val="21"/>
-          <w:lang w:eastAsia="es-419"/>
+          <w:lang w:val="en-US" w:eastAsia="es-419"/>
         </w:rPr>
         <w:t xml:space="preserve"> </w:t>
       </w:r>
@@ -1559,7 +1567,7 @@
           <w:color w:val="9ABDF5"/>
           <w:sz w:val="21"/>
           <w:szCs w:val="21"/>
-          <w:lang w:eastAsia="es-419"/>
+          <w:lang w:val="en-US" w:eastAsia="es-419"/>
         </w:rPr>
         <w:t>}</w:t>
       </w:r>
@@ -1569,7 +1577,7 @@
           <w:color w:val="89DDFF"/>
           <w:sz w:val="21"/>
           <w:szCs w:val="21"/>
-          <w:lang w:eastAsia="es-419"/>
+          <w:lang w:val="en-US" w:eastAsia="es-419"/>
         </w:rPr>
         <w:t>,</w:t>
       </w:r>
@@ -1583,7 +1591,7 @@
           <w:color w:val="A9B1D6"/>
           <w:sz w:val="21"/>
           <w:szCs w:val="21"/>
-          <w:lang w:eastAsia="es-419"/>
+          <w:lang w:val="en-US" w:eastAsia="es-419"/>
         </w:rPr>
       </w:pPr>
       <w:r>
@@ -1592,7 +1600,7 @@
           <w:color w:val="9ABDF5"/>
           <w:sz w:val="21"/>
           <w:szCs w:val="21"/>
-          <w:lang w:eastAsia="es-419"/>
+          <w:lang w:val="en-US" w:eastAsia="es-419"/>
         </w:rPr>
         <w:t>]</w:t>
       </w:r>
@@ -1602,12 +1610,18 @@
           <w:color w:val="89DDFF"/>
           <w:sz w:val="21"/>
           <w:szCs w:val="21"/>
-          <w:lang w:eastAsia="es-419"/>
+          <w:lang w:val="en-US" w:eastAsia="es-419"/>
         </w:rPr>
         <w:t>;</w:t>
       </w:r>
     </w:p>
-    <w:p/>
+    <w:p>
+      <w:pPr>
+        <w:rPr>
+          <w:lang w:val="en-US"/>
+        </w:rPr>
+      </w:pPr>
+    </w:p>
     <w:p>
       <w:pPr>
         <w:rPr>
@@ -1665,7 +1679,7 @@
           <w:color w:val="A9B1D6"/>
           <w:sz w:val="21"/>
           <w:szCs w:val="21"/>
-          <w:lang w:eastAsia="es-419"/>
+          <w:lang w:val="en-US" w:eastAsia="es-419"/>
         </w:rPr>
       </w:pPr>
       <w:r>
@@ -1684,7 +1698,7 @@
           <w:color w:val="73DACA"/>
           <w:sz w:val="21"/>
           <w:szCs w:val="21"/>
-          <w:lang w:eastAsia="es-419"/>
+          <w:lang w:val="en-US" w:eastAsia="es-419"/>
         </w:rPr>
         <w:t>memberDivision</w:t>
       </w:r>
@@ -1694,7 +1708,7 @@
           <w:color w:val="89DDFF"/>
           <w:sz w:val="21"/>
           <w:szCs w:val="21"/>
-          <w:lang w:eastAsia="es-419"/>
+          <w:lang w:val="en-US" w:eastAsia="es-419"/>
         </w:rPr>
         <w:t>:</w:t>
       </w:r>
@@ -1704,7 +1718,7 @@
           <w:color w:val="A9B1D6"/>
           <w:sz w:val="21"/>
           <w:szCs w:val="21"/>
-          <w:lang w:eastAsia="es-419"/>
+          <w:lang w:val="en-US" w:eastAsia="es-419"/>
         </w:rPr>
         <w:t xml:space="preserve"> </w:t>
       </w:r>
@@ -1714,7 +1728,7 @@
           <w:color w:val="C0CAF5"/>
           <w:sz w:val="21"/>
           <w:szCs w:val="21"/>
-          <w:lang w:eastAsia="es-419"/>
+          <w:lang w:val="en-US" w:eastAsia="es-419"/>
         </w:rPr>
         <w:t>_mock</w:t>
       </w:r>
@@ -1724,7 +1738,7 @@
           <w:color w:val="89DDFF"/>
           <w:sz w:val="21"/>
           <w:szCs w:val="21"/>
-          <w:lang w:eastAsia="es-419"/>
+          <w:lang w:val="en-US" w:eastAsia="es-419"/>
         </w:rPr>
         <w:t>.</w:t>
       </w:r>
@@ -1734,7 +1748,7 @@
           <w:color w:val="7AA2F7"/>
           <w:sz w:val="21"/>
           <w:szCs w:val="21"/>
-          <w:lang w:eastAsia="es-419"/>
+          <w:lang w:val="en-US" w:eastAsia="es-419"/>
         </w:rPr>
         <w:t>memberDivisionNames</w:t>
       </w:r>
@@ -1744,7 +1758,7 @@
           <w:color w:val="9ABDF5"/>
           <w:sz w:val="21"/>
           <w:szCs w:val="21"/>
-          <w:lang w:eastAsia="es-419"/>
+          <w:lang w:val="en-US" w:eastAsia="es-419"/>
         </w:rPr>
         <w:t>(</w:t>
       </w:r>
@@ -1754,7 +1768,7 @@
           <w:color w:val="C0CAF5"/>
           <w:sz w:val="21"/>
           <w:szCs w:val="21"/>
-          <w:lang w:eastAsia="es-419"/>
+          <w:lang w:val="en-US" w:eastAsia="es-419"/>
         </w:rPr>
         <w:t>index</w:t>
       </w:r>
@@ -1764,7 +1778,7 @@
           <w:color w:val="9ABDF5"/>
           <w:sz w:val="21"/>
           <w:szCs w:val="21"/>
-          <w:lang w:eastAsia="es-419"/>
+          <w:lang w:val="en-US" w:eastAsia="es-419"/>
         </w:rPr>
         <w:t>)</w:t>
       </w:r>
@@ -1774,7 +1788,7 @@
           <w:color w:val="89DDFF"/>
           <w:sz w:val="21"/>
           <w:szCs w:val="21"/>
-          <w:lang w:eastAsia="es-419"/>
+          <w:lang w:val="en-US" w:eastAsia="es-419"/>
         </w:rPr>
         <w:t>,</w:t>
       </w:r>
@@ -2276,6 +2290,488 @@
           <w:lang w:val="en-US"/>
         </w:rPr>
       </w:pPr>
+      <w:r>
+        <w:rPr>
+          <w:lang w:val="en-US"/>
+        </w:rPr>
+        <w:br w:type="page"/>
+      </w:r>
+    </w:p>
+    <w:p>
+      <w:pPr>
+        <w:rPr>
+          <w:lang w:val="en-US"/>
+        </w:rPr>
+      </w:pPr>
+      <w:r>
+        <w:rPr>
+          <w:lang w:val="en-US"/>
+        </w:rPr>
+        <w:lastRenderedPageBreak/>
+        <w:t>EMAIL</w:t>
+      </w:r>
+    </w:p>
+    <w:p>
+      <w:pPr>
+        <w:rPr>
+          <w:lang w:val="en-US"/>
+        </w:rPr>
+      </w:pPr>
+      <w:r>
+        <w:rPr>
+          <w:lang w:val="en-US"/>
+        </w:rPr>
+        <w:t>src\sections\member\member-table-row.jsx</w:t>
+      </w:r>
+    </w:p>
+    <w:p>
+      <w:pPr>
+        <w:shd w:val="clear" w:color="auto" w:fill="24283B"/>
+        <w:spacing w:after="0" w:line="285" w:lineRule="atLeast"/>
+        <w:rPr>
+          <w:rFonts w:ascii="Consolas" w:eastAsia="Times New Roman" w:hAnsi="Consolas" w:cs="Times New Roman"/>
+          <w:color w:val="A9B1D6"/>
+          <w:sz w:val="21"/>
+          <w:szCs w:val="21"/>
+          <w:lang w:val="en-US" w:eastAsia="es-419"/>
+        </w:rPr>
+      </w:pPr>
+      <w:r>
+        <w:rPr>
+          <w:rFonts w:ascii="Consolas" w:eastAsia="Times New Roman" w:hAnsi="Consolas" w:cs="Times New Roman"/>
+          <w:color w:val="BA3C97"/>
+          <w:sz w:val="21"/>
+          <w:szCs w:val="21"/>
+          <w:lang w:val="en-US" w:eastAsia="es-419"/>
+        </w:rPr>
+        <w:t>&lt;</w:t>
+      </w:r>
+      <w:r>
+        <w:rPr>
+          <w:rFonts w:ascii="Consolas" w:eastAsia="Times New Roman" w:hAnsi="Consolas" w:cs="Times New Roman"/>
+          <w:color w:val="DE5971"/>
+          <w:sz w:val="21"/>
+          <w:szCs w:val="21"/>
+          <w:lang w:val="en-US" w:eastAsia="es-419"/>
+        </w:rPr>
+        <w:t xml:space="preserve">Box </w:t>
+      </w:r>
+      <w:r>
+        <w:rPr>
+          <w:rFonts w:ascii="Consolas" w:eastAsia="Times New Roman" w:hAnsi="Consolas" w:cs="Times New Roman"/>
+          <w:color w:val="BB9AF7"/>
+          <w:sz w:val="21"/>
+          <w:szCs w:val="21"/>
+          <w:lang w:val="en-US" w:eastAsia="es-419"/>
+        </w:rPr>
+        <w:t>component</w:t>
+      </w:r>
+      <w:r>
+        <w:rPr>
+          <w:rFonts w:ascii="Consolas" w:eastAsia="Times New Roman" w:hAnsi="Consolas" w:cs="Times New Roman"/>
+          <w:color w:val="89DDFF"/>
+          <w:sz w:val="21"/>
+          <w:szCs w:val="21"/>
+          <w:lang w:val="en-US" w:eastAsia="es-419"/>
+        </w:rPr>
+        <w:t>="</w:t>
+      </w:r>
+      <w:r>
+        <w:rPr>
+          <w:rFonts w:ascii="Consolas" w:eastAsia="Times New Roman" w:hAnsi="Consolas" w:cs="Times New Roman"/>
+          <w:color w:val="9ECE6A"/>
+          <w:sz w:val="21"/>
+          <w:szCs w:val="21"/>
+          <w:lang w:val="en-US" w:eastAsia="es-419"/>
+        </w:rPr>
+        <w:t>span</w:t>
+      </w:r>
+      <w:r>
+        <w:rPr>
+          <w:rFonts w:ascii="Consolas" w:eastAsia="Times New Roman" w:hAnsi="Consolas" w:cs="Times New Roman"/>
+          <w:color w:val="89DDFF"/>
+          <w:sz w:val="21"/>
+          <w:szCs w:val="21"/>
+          <w:lang w:val="en-US" w:eastAsia="es-419"/>
+        </w:rPr>
+        <w:t>"</w:t>
+      </w:r>
+      <w:r>
+        <w:rPr>
+          <w:rFonts w:ascii="Consolas" w:eastAsia="Times New Roman" w:hAnsi="Consolas" w:cs="Times New Roman"/>
+          <w:color w:val="DE5971"/>
+          <w:sz w:val="21"/>
+          <w:szCs w:val="21"/>
+          <w:lang w:val="en-US" w:eastAsia="es-419"/>
+        </w:rPr>
+        <w:t xml:space="preserve"> </w:t>
+      </w:r>
+      <w:r>
+        <w:rPr>
+          <w:rFonts w:ascii="Consolas" w:eastAsia="Times New Roman" w:hAnsi="Consolas" w:cs="Times New Roman"/>
+          <w:color w:val="BB9AF7"/>
+          <w:sz w:val="21"/>
+          <w:szCs w:val="21"/>
+          <w:lang w:val="en-US" w:eastAsia="es-419"/>
+        </w:rPr>
+        <w:t>sx</w:t>
+      </w:r>
+      <w:r>
+        <w:rPr>
+          <w:rFonts w:ascii="Consolas" w:eastAsia="Times New Roman" w:hAnsi="Consolas" w:cs="Times New Roman"/>
+          <w:color w:val="89DDFF"/>
+          <w:sz w:val="21"/>
+          <w:szCs w:val="21"/>
+          <w:lang w:val="en-US" w:eastAsia="es-419"/>
+        </w:rPr>
+        <w:t>=</w:t>
+      </w:r>
+      <w:r>
+        <w:rPr>
+          <w:rFonts w:ascii="Consolas" w:eastAsia="Times New Roman" w:hAnsi="Consolas" w:cs="Times New Roman"/>
+          <w:color w:val="7DCFFF"/>
+          <w:sz w:val="21"/>
+          <w:szCs w:val="21"/>
+          <w:lang w:val="en-US" w:eastAsia="es-419"/>
+        </w:rPr>
+        <w:t>{</w:t>
+      </w:r>
+      <w:r>
+        <w:rPr>
+          <w:rFonts w:ascii="Consolas" w:eastAsia="Times New Roman" w:hAnsi="Consolas" w:cs="Times New Roman"/>
+          <w:color w:val="9ABDF5"/>
+          <w:sz w:val="21"/>
+          <w:szCs w:val="21"/>
+          <w:lang w:val="en-US" w:eastAsia="es-419"/>
+        </w:rPr>
+        <w:t>{</w:t>
+      </w:r>
+      <w:r>
+        <w:rPr>
+          <w:rFonts w:ascii="Consolas" w:eastAsia="Times New Roman" w:hAnsi="Consolas" w:cs="Times New Roman"/>
+          <w:color w:val="DE5971"/>
+          <w:sz w:val="21"/>
+          <w:szCs w:val="21"/>
+          <w:lang w:val="en-US" w:eastAsia="es-419"/>
+        </w:rPr>
+        <w:t xml:space="preserve"> </w:t>
+      </w:r>
+      <w:r>
+        <w:rPr>
+          <w:rFonts w:ascii="Consolas" w:eastAsia="Times New Roman" w:hAnsi="Consolas" w:cs="Times New Roman"/>
+          <w:color w:val="73DACA"/>
+          <w:sz w:val="21"/>
+          <w:szCs w:val="21"/>
+          <w:lang w:val="en-US" w:eastAsia="es-419"/>
+        </w:rPr>
+        <w:t>color</w:t>
+      </w:r>
+      <w:r>
+        <w:rPr>
+          <w:rFonts w:ascii="Consolas" w:eastAsia="Times New Roman" w:hAnsi="Consolas" w:cs="Times New Roman"/>
+          <w:color w:val="89DDFF"/>
+          <w:sz w:val="21"/>
+          <w:szCs w:val="21"/>
+          <w:lang w:val="en-US" w:eastAsia="es-419"/>
+        </w:rPr>
+        <w:t>:</w:t>
+      </w:r>
+      <w:r>
+        <w:rPr>
+          <w:rFonts w:ascii="Consolas" w:eastAsia="Times New Roman" w:hAnsi="Consolas" w:cs="Times New Roman"/>
+          <w:color w:val="DE5971"/>
+          <w:sz w:val="21"/>
+          <w:szCs w:val="21"/>
+          <w:lang w:val="en-US" w:eastAsia="es-419"/>
+        </w:rPr>
+        <w:t xml:space="preserve"> </w:t>
+      </w:r>
+      <w:r>
+        <w:rPr>
+          <w:rFonts w:ascii="Consolas" w:eastAsia="Times New Roman" w:hAnsi="Consolas" w:cs="Times New Roman"/>
+          <w:color w:val="89DDFF"/>
+          <w:sz w:val="21"/>
+          <w:szCs w:val="21"/>
+          <w:lang w:val="en-US" w:eastAsia="es-419"/>
+        </w:rPr>
+        <w:t>'</w:t>
+      </w:r>
+      <w:r>
+        <w:rPr>
+          <w:rFonts w:ascii="Consolas" w:eastAsia="Times New Roman" w:hAnsi="Consolas" w:cs="Times New Roman"/>
+          <w:color w:val="9ECE6A"/>
+          <w:sz w:val="21"/>
+          <w:szCs w:val="21"/>
+          <w:lang w:val="en-US" w:eastAsia="es-419"/>
+        </w:rPr>
+        <w:t>text.disabled</w:t>
+      </w:r>
+      <w:r>
+        <w:rPr>
+          <w:rFonts w:ascii="Consolas" w:eastAsia="Times New Roman" w:hAnsi="Consolas" w:cs="Times New Roman"/>
+          <w:color w:val="89DDFF"/>
+          <w:sz w:val="21"/>
+          <w:szCs w:val="21"/>
+          <w:lang w:val="en-US" w:eastAsia="es-419"/>
+        </w:rPr>
+        <w:t>'</w:t>
+      </w:r>
+      <w:r>
+        <w:rPr>
+          <w:rFonts w:ascii="Consolas" w:eastAsia="Times New Roman" w:hAnsi="Consolas" w:cs="Times New Roman"/>
+          <w:color w:val="DE5971"/>
+          <w:sz w:val="21"/>
+          <w:szCs w:val="21"/>
+          <w:lang w:val="en-US" w:eastAsia="es-419"/>
+        </w:rPr>
+        <w:t xml:space="preserve"> </w:t>
+      </w:r>
+      <w:r>
+        <w:rPr>
+          <w:rFonts w:ascii="Consolas" w:eastAsia="Times New Roman" w:hAnsi="Consolas" w:cs="Times New Roman"/>
+          <w:color w:val="9ABDF5"/>
+          <w:sz w:val="21"/>
+          <w:szCs w:val="21"/>
+          <w:lang w:val="en-US" w:eastAsia="es-419"/>
+        </w:rPr>
+        <w:t>}</w:t>
+      </w:r>
+      <w:r>
+        <w:rPr>
+          <w:rFonts w:ascii="Consolas" w:eastAsia="Times New Roman" w:hAnsi="Consolas" w:cs="Times New Roman"/>
+          <w:color w:val="7DCFFF"/>
+          <w:sz w:val="21"/>
+          <w:szCs w:val="21"/>
+          <w:lang w:val="en-US" w:eastAsia="es-419"/>
+        </w:rPr>
+        <w:t>}</w:t>
+      </w:r>
+      <w:r>
+        <w:rPr>
+          <w:rFonts w:ascii="Consolas" w:eastAsia="Times New Roman" w:hAnsi="Consolas" w:cs="Times New Roman"/>
+          <w:color w:val="BA3C97"/>
+          <w:sz w:val="21"/>
+          <w:szCs w:val="21"/>
+          <w:lang w:val="en-US" w:eastAsia="es-419"/>
+        </w:rPr>
+        <w:t>&gt;</w:t>
+      </w:r>
+    </w:p>
+    <w:p>
+      <w:pPr>
+        <w:shd w:val="clear" w:color="auto" w:fill="24283B"/>
+        <w:spacing w:after="0" w:line="285" w:lineRule="atLeast"/>
+        <w:rPr>
+          <w:rFonts w:ascii="Consolas" w:eastAsia="Times New Roman" w:hAnsi="Consolas" w:cs="Times New Roman"/>
+          <w:color w:val="A9B1D6"/>
+          <w:sz w:val="21"/>
+          <w:szCs w:val="21"/>
+          <w:lang w:eastAsia="es-419"/>
+        </w:rPr>
+      </w:pPr>
+      <w:r>
+        <w:rPr>
+          <w:rFonts w:ascii="Consolas" w:eastAsia="Times New Roman" w:hAnsi="Consolas" w:cs="Times New Roman"/>
+          <w:color w:val="9AA5CE"/>
+          <w:sz w:val="21"/>
+          <w:szCs w:val="21"/>
+          <w:lang w:val="en-US" w:eastAsia="es-419"/>
+        </w:rPr>
+        <w:t xml:space="preserve">                </w:t>
+      </w:r>
+      <w:r>
+        <w:rPr>
+          <w:rFonts w:ascii="Consolas" w:eastAsia="Times New Roman" w:hAnsi="Consolas" w:cs="Times New Roman"/>
+          <w:color w:val="7DCFFF"/>
+          <w:sz w:val="21"/>
+          <w:szCs w:val="21"/>
+          <w:highlight w:val="darkGreen"/>
+          <w:lang w:eastAsia="es-419"/>
+        </w:rPr>
+        <w:t>{</w:t>
+      </w:r>
+      <w:r>
+        <w:rPr>
+          <w:rFonts w:ascii="Consolas" w:eastAsia="Times New Roman" w:hAnsi="Consolas" w:cs="Times New Roman"/>
+          <w:color w:val="C0CAF5"/>
+          <w:sz w:val="21"/>
+          <w:szCs w:val="21"/>
+          <w:highlight w:val="darkGreen"/>
+          <w:lang w:eastAsia="es-419"/>
+        </w:rPr>
+        <w:t>row</w:t>
+      </w:r>
+      <w:r>
+        <w:rPr>
+          <w:rFonts w:ascii="Consolas" w:eastAsia="Times New Roman" w:hAnsi="Consolas" w:cs="Times New Roman"/>
+          <w:color w:val="89DDFF"/>
+          <w:sz w:val="21"/>
+          <w:szCs w:val="21"/>
+          <w:highlight w:val="darkGreen"/>
+          <w:lang w:eastAsia="es-419"/>
+        </w:rPr>
+        <w:t>.</w:t>
+      </w:r>
+      <w:r>
+        <w:rPr>
+          <w:rFonts w:ascii="Consolas" w:eastAsia="Times New Roman" w:hAnsi="Consolas" w:cs="Times New Roman"/>
+          <w:color w:val="7DCFFF"/>
+          <w:sz w:val="21"/>
+          <w:szCs w:val="21"/>
+          <w:highlight w:val="darkGreen"/>
+          <w:lang w:eastAsia="es-419"/>
+        </w:rPr>
+        <w:t>memberEmail}</w:t>
+      </w:r>
+    </w:p>
+    <w:p>
+      <w:pPr>
+        <w:shd w:val="clear" w:color="auto" w:fill="24283B"/>
+        <w:spacing w:after="0" w:line="285" w:lineRule="atLeast"/>
+        <w:rPr>
+          <w:rFonts w:ascii="Consolas" w:eastAsia="Times New Roman" w:hAnsi="Consolas" w:cs="Times New Roman"/>
+          <w:color w:val="A9B1D6"/>
+          <w:sz w:val="21"/>
+          <w:szCs w:val="21"/>
+          <w:lang w:eastAsia="es-419"/>
+        </w:rPr>
+      </w:pPr>
+      <w:r>
+        <w:rPr>
+          <w:rFonts w:ascii="Consolas" w:eastAsia="Times New Roman" w:hAnsi="Consolas" w:cs="Times New Roman"/>
+          <w:color w:val="BA3C97"/>
+          <w:sz w:val="21"/>
+          <w:szCs w:val="21"/>
+          <w:lang w:eastAsia="es-419"/>
+        </w:rPr>
+        <w:t>&lt;/</w:t>
+      </w:r>
+      <w:r>
+        <w:rPr>
+          <w:rFonts w:ascii="Consolas" w:eastAsia="Times New Roman" w:hAnsi="Consolas" w:cs="Times New Roman"/>
+          <w:color w:val="DE5971"/>
+          <w:sz w:val="21"/>
+          <w:szCs w:val="21"/>
+          <w:lang w:eastAsia="es-419"/>
+        </w:rPr>
+        <w:t>Box</w:t>
+      </w:r>
+      <w:r>
+        <w:rPr>
+          <w:rFonts w:ascii="Consolas" w:eastAsia="Times New Roman" w:hAnsi="Consolas" w:cs="Times New Roman"/>
+          <w:color w:val="BA3C97"/>
+          <w:sz w:val="21"/>
+          <w:szCs w:val="21"/>
+          <w:lang w:eastAsia="es-419"/>
+        </w:rPr>
+        <w:t>&gt;</w:t>
+      </w:r>
+    </w:p>
+    <w:p>
+      <w:pPr>
+        <w:rPr>
+          <w:lang w:val="en-US"/>
+        </w:rPr>
+      </w:pPr>
+    </w:p>
+    <w:p>
+      <w:pPr>
+        <w:rPr>
+          <w:lang w:val="en-US"/>
+        </w:rPr>
+      </w:pPr>
+    </w:p>
+    <w:p>
+      <w:pPr>
+        <w:rPr>
+          <w:lang w:val="en-US"/>
+        </w:rPr>
+      </w:pPr>
+      <w:r>
+        <w:rPr>
+          <w:lang w:val="en-US"/>
+        </w:rPr>
+        <w:t>src\_mock\_member.js</w:t>
+      </w:r>
+    </w:p>
+    <w:p>
+      <w:pPr>
+        <w:rPr>
+          <w:lang w:val="en-US"/>
+        </w:rPr>
+      </w:pPr>
+      <w:r>
+        <w:rPr>
+          <w:lang w:val="en-US"/>
+        </w:rPr>
+        <w:t>\src\_mock\_mock.js</w:t>
+      </w:r>
+      <w:r>
+        <w:rPr>
+          <w:lang w:val="en-US"/>
+        </w:rPr>
+        <w:t xml:space="preserve"> (</w:t>
+      </w:r>
+      <w:r>
+        <w:rPr>
+          <w:b/>
+          <w:bCs/>
+          <w:lang w:val="en-US"/>
+        </w:rPr>
+        <w:t>crear</w:t>
+      </w:r>
+      <w:r>
+        <w:rPr>
+          <w:lang w:val="en-US"/>
+        </w:rPr>
+        <w:t>)</w:t>
+      </w:r>
+    </w:p>
+    <w:p>
+      <w:pPr>
+        <w:rPr>
+          <w:lang w:val="en-US"/>
+        </w:rPr>
+      </w:pPr>
+      <w:r>
+        <w:rPr>
+          <w:lang w:val="en-US"/>
+        </w:rPr>
+        <w:t>src\_mock\assets.js</w:t>
+      </w:r>
+      <w:r>
+        <w:rPr>
+          <w:lang w:val="en-US"/>
+        </w:rPr>
+        <w:t xml:space="preserve"> </w:t>
+      </w:r>
+    </w:p>
+    <w:p>
+      <w:pPr>
+        <w:rPr>
+          <w:lang w:val="en-US"/>
+        </w:rPr>
+      </w:pPr>
+      <w:r>
+        <w:rPr>
+          <w:lang w:val="en-US"/>
+        </w:rPr>
+        <w:br w:type="page"/>
+      </w:r>
+    </w:p>
+    <w:p>
+      <w:r>
+        <w:lastRenderedPageBreak/>
+        <w:t>Para disminuir el número de l</w:t>
+      </w:r>
+      <w:r>
+        <w:t xml:space="preserve">a lista </w:t>
+      </w:r>
+    </w:p>
+    <w:p>
+      <w:r>
+        <w:t>Array.from({ length: 20</w:t>
+      </w:r>
     </w:p>
     <w:sectPr>
       <w:pgSz w:w="11906" w:h="16838"/>

</xml_diff>